<commit_message>
add figure to SAP template
</commit_message>
<xml_diff>
--- a/doc/SAP/StatisticalAnalysisPlan-template.docx
+++ b/doc/SAP/StatisticalAnalysisPlan-template.docx
@@ -7685,7 +7685,7 @@
         <mc:AlternateContent>
           <mc:Choice Requires="wps">
             <w:drawing>
-              <wp:anchor distT="0" distB="0" distL="114300" distR="114300" simplePos="0" relativeHeight="251692032" behindDoc="0" locked="0" layoutInCell="1" allowOverlap="1" wp14:anchorId="7A78382B" wp14:editId="3C50F8F6">
+              <wp:anchor distT="0" distB="0" distL="114300" distR="114300" simplePos="0" relativeHeight="251692032" behindDoc="0" locked="0" layoutInCell="1" allowOverlap="1" wp14:anchorId="7A78382B" wp14:editId="7C20636B">
                 <wp:simplePos x="0" y="0"/>
                 <wp:positionH relativeFrom="column">
                   <wp:posOffset>2302329</wp:posOffset>
@@ -7810,7 +7810,7 @@
         <mc:AlternateContent>
           <mc:Choice Requires="wps">
             <w:drawing>
-              <wp:anchor distT="0" distB="0" distL="114300" distR="114300" simplePos="0" relativeHeight="251702272" behindDoc="0" locked="0" layoutInCell="1" allowOverlap="1" wp14:anchorId="7DC81500" wp14:editId="70152D3A">
+              <wp:anchor distT="0" distB="0" distL="114300" distR="114300" simplePos="0" relativeHeight="251702272" behindDoc="0" locked="0" layoutInCell="1" allowOverlap="1" wp14:anchorId="7DC81500" wp14:editId="09372BC0">
                 <wp:simplePos x="0" y="0"/>
                 <wp:positionH relativeFrom="column">
                   <wp:posOffset>3559228</wp:posOffset>
@@ -8417,7 +8417,7 @@
         <mc:AlternateContent>
           <mc:Choice Requires="wps">
             <w:drawing>
-              <wp:anchor distT="0" distB="0" distL="114300" distR="114300" simplePos="0" relativeHeight="251706368" behindDoc="1" locked="0" layoutInCell="1" allowOverlap="1" wp14:anchorId="3305E3A1" wp14:editId="711ADFE4">
+              <wp:anchor distT="0" distB="0" distL="114300" distR="114300" simplePos="0" relativeHeight="251706368" behindDoc="1" locked="0" layoutInCell="1" allowOverlap="1" wp14:anchorId="3305E3A1" wp14:editId="4635D7B9">
                 <wp:simplePos x="0" y="0"/>
                 <wp:positionH relativeFrom="column">
                   <wp:posOffset>2825321</wp:posOffset>
@@ -8728,7 +8728,7 @@
         <mc:AlternateContent>
           <mc:Choice Requires="wps">
             <w:drawing>
-              <wp:anchor distT="0" distB="0" distL="114300" distR="114300" simplePos="0" relativeHeight="251676672" behindDoc="0" locked="0" layoutInCell="1" allowOverlap="1" wp14:anchorId="38A89D7F" wp14:editId="1C4839B9">
+              <wp:anchor distT="0" distB="0" distL="114300" distR="114300" simplePos="0" relativeHeight="251676672" behindDoc="0" locked="0" layoutInCell="1" allowOverlap="1" wp14:anchorId="38A89D7F" wp14:editId="0C392190">
                 <wp:simplePos x="0" y="0"/>
                 <wp:positionH relativeFrom="column">
                   <wp:posOffset>167691</wp:posOffset>
@@ -9660,6 +9660,67 @@
           <w:color w:val="215E99" w:themeColor="text2" w:themeTint="BF"/>
           <w:lang w:val="en-US"/>
         </w:rPr>
+        <w:drawing>
+          <wp:anchor distT="0" distB="0" distL="114300" distR="114300" simplePos="0" relativeHeight="251722752" behindDoc="0" locked="0" layoutInCell="1" allowOverlap="1" wp14:anchorId="522BF4DC" wp14:editId="1C0A2D46">
+            <wp:simplePos x="0" y="0"/>
+            <wp:positionH relativeFrom="margin">
+              <wp:posOffset>4722495</wp:posOffset>
+            </wp:positionH>
+            <wp:positionV relativeFrom="paragraph">
+              <wp:posOffset>725170</wp:posOffset>
+            </wp:positionV>
+            <wp:extent cx="1755775" cy="1525270"/>
+            <wp:effectExtent l="0" t="0" r="0" b="0"/>
+            <wp:wrapSquare wrapText="bothSides"/>
+            <wp:docPr id="2100943841" name="Billede 1"/>
+            <wp:cNvGraphicFramePr>
+              <a:graphicFrameLocks xmlns:a="http://schemas.openxmlformats.org/drawingml/2006/main" noChangeAspect="1"/>
+            </wp:cNvGraphicFramePr>
+            <a:graphic xmlns:a="http://schemas.openxmlformats.org/drawingml/2006/main">
+              <a:graphicData uri="http://schemas.openxmlformats.org/drawingml/2006/picture">
+                <pic:pic xmlns:pic="http://schemas.openxmlformats.org/drawingml/2006/picture">
+                  <pic:nvPicPr>
+                    <pic:cNvPr id="2100943841" name=""/>
+                    <pic:cNvPicPr/>
+                  </pic:nvPicPr>
+                  <pic:blipFill>
+                    <a:blip r:embed="rId12" cstate="print">
+                      <a:extLst>
+                        <a:ext uri="{28A0092B-C50C-407E-A947-70E740481C1C}">
+                          <a14:useLocalDpi xmlns:a14="http://schemas.microsoft.com/office/drawing/2010/main" val="0"/>
+                        </a:ext>
+                      </a:extLst>
+                    </a:blip>
+                    <a:stretch>
+                      <a:fillRect/>
+                    </a:stretch>
+                  </pic:blipFill>
+                  <pic:spPr>
+                    <a:xfrm>
+                      <a:off x="0" y="0"/>
+                      <a:ext cx="1755775" cy="1525270"/>
+                    </a:xfrm>
+                    <a:prstGeom prst="rect">
+                      <a:avLst/>
+                    </a:prstGeom>
+                  </pic:spPr>
+                </pic:pic>
+              </a:graphicData>
+            </a:graphic>
+            <wp14:sizeRelH relativeFrom="margin">
+              <wp14:pctWidth>0</wp14:pctWidth>
+            </wp14:sizeRelH>
+            <wp14:sizeRelV relativeFrom="margin">
+              <wp14:pctHeight>0</wp14:pctHeight>
+            </wp14:sizeRelV>
+          </wp:anchor>
+        </w:drawing>
+      </w:r>
+      <w:r>
+        <w:rPr>
+          <w:color w:val="215E99" w:themeColor="text2" w:themeTint="BF"/>
+          <w:lang w:val="en-US"/>
+        </w:rPr>
         <w:t>Unfortunately,</w:t>
       </w:r>
       <w:r>
@@ -9795,7 +9856,29 @@
           <w:color w:val="215E99" w:themeColor="text2" w:themeTint="BF"/>
           <w:lang w:val="en-US"/>
         </w:rPr>
-        <w:t>obtain a less conservative adjustment. Can be anti-conservative in small samples and require dedicated software. Adjusted confidence intervals are available.</w:t>
+        <w:t>obtain a less conservative adjustment</w:t>
+      </w:r>
+      <w:r>
+        <w:rPr>
+          <w:color w:val="215E99" w:themeColor="text2" w:themeTint="BF"/>
+          <w:lang w:val="en-US"/>
+        </w:rPr>
+        <w:t xml:space="preserve">. See the figure for an illustration for a raw p-value of 0.0357 which would become 0.107 after Bonferroni adjustment </w:t>
+      </w:r>
+      <w:r>
+        <w:rPr>
+          <w:color w:val="215E99" w:themeColor="text2" w:themeTint="BF"/>
+          <w:lang w:val="en-US"/>
+        </w:rPr>
+        <w:lastRenderedPageBreak/>
+        <w:t xml:space="preserve">for 3 tests (assumed equally correlated) </w:t>
+      </w:r>
+      <w:r>
+        <w:rPr>
+          <w:color w:val="215E99" w:themeColor="text2" w:themeTint="BF"/>
+          <w:lang w:val="en-US"/>
+        </w:rPr>
+        <w:t>. Can be anti-conservative in small samples and require dedicated software. Adjusted confidence intervals are available.</w:t>
       </w:r>
     </w:p>
     <w:p>
@@ -9815,7 +9898,6 @@
           <w:color w:val="215E99" w:themeColor="text2" w:themeTint="BF"/>
           <w:lang w:val="en-US"/>
         </w:rPr>
-        <w:lastRenderedPageBreak/>
         <w:t xml:space="preserve">Step down procedures such as </w:t>
       </w:r>
       <w:r>
@@ -12362,114 +12444,6 @@
     <w:p>
       <w:pPr>
         <w:rPr>
-          <w:color w:val="215E99" w:themeColor="text2" w:themeTint="BF"/>
-          <w:lang w:val="en-US"/>
-        </w:rPr>
-      </w:pPr>
-      <w:r>
-        <w:rPr>
-          <w:color w:val="215E99" w:themeColor="text2" w:themeTint="BF"/>
-          <w:lang w:val="en-US"/>
-        </w:rPr>
-        <w:t>Again gatekeeping can be used in conjunction with other adjustment technics, e.g., Bonferroni adjust H</w:t>
-      </w:r>
-      <w:r>
-        <w:rPr>
-          <w:color w:val="215E99" w:themeColor="text2" w:themeTint="BF"/>
-          <w:vertAlign w:val="subscript"/>
-          <w:lang w:val="en-US"/>
-        </w:rPr>
-        <w:t>2,1</w:t>
-      </w:r>
-      <w:r>
-        <w:rPr>
-          <w:color w:val="215E99" w:themeColor="text2" w:themeTint="BF"/>
-          <w:lang w:val="en-US"/>
-        </w:rPr>
-        <w:t xml:space="preserve"> and H</w:t>
-      </w:r>
-      <w:r>
-        <w:rPr>
-          <w:color w:val="215E99" w:themeColor="text2" w:themeTint="BF"/>
-          <w:vertAlign w:val="subscript"/>
-          <w:lang w:val="en-US"/>
-        </w:rPr>
-        <w:t>2,2</w:t>
-      </w:r>
-      <w:r>
-        <w:rPr>
-          <w:color w:val="215E99" w:themeColor="text2" w:themeTint="BF"/>
-          <w:lang w:val="en-US"/>
-        </w:rPr>
-        <w:t xml:space="preserve"> and if any is rejected Bonferroni adjust H</w:t>
-      </w:r>
-      <w:r>
-        <w:rPr>
-          <w:color w:val="215E99" w:themeColor="text2" w:themeTint="BF"/>
-          <w:vertAlign w:val="subscript"/>
-          <w:lang w:val="en-US"/>
-        </w:rPr>
-        <w:t>2,3</w:t>
-      </w:r>
-      <w:r>
-        <w:rPr>
-          <w:color w:val="215E99" w:themeColor="text2" w:themeTint="BF"/>
-          <w:lang w:val="en-US"/>
-        </w:rPr>
-        <w:t xml:space="preserve"> and H</w:t>
-      </w:r>
-      <w:r>
-        <w:rPr>
-          <w:color w:val="215E99" w:themeColor="text2" w:themeTint="BF"/>
-          <w:vertAlign w:val="subscript"/>
-          <w:lang w:val="en-US"/>
-        </w:rPr>
-        <w:t>2,4</w:t>
-      </w:r>
-      <w:r>
-        <w:rPr>
-          <w:color w:val="215E99" w:themeColor="text2" w:themeTint="BF"/>
-          <w:lang w:val="en-US"/>
-        </w:rPr>
-        <w:t xml:space="preserve">. This </w:t>
-      </w:r>
-      <w:r>
-        <w:rPr>
-          <w:color w:val="215E99" w:themeColor="text2" w:themeTint="BF"/>
-          <w:lang w:val="en-US"/>
-        </w:rPr>
-        <w:t xml:space="preserve">can quickly become technical so a </w:t>
-      </w:r>
-      <w:commentRangeStart w:id="25"/>
-      <w:r>
-        <w:rPr>
-          <w:color w:val="215E99" w:themeColor="text2" w:themeTint="BF"/>
-          <w:lang w:val="en-US"/>
-        </w:rPr>
-        <w:t xml:space="preserve">graphical representation </w:t>
-      </w:r>
-      <w:commentRangeEnd w:id="25"/>
-      <w:r>
-        <w:rPr>
-          <w:rStyle w:val="Kommentarhenvisning"/>
-          <w:color w:val="215E99" w:themeColor="text2" w:themeTint="BF"/>
-          <w:sz w:val="24"/>
-          <w:szCs w:val="24"/>
-          <w:lang w:val="en-US"/>
-        </w:rPr>
-        <w:commentReference w:id="25"/>
-      </w:r>
-      <w:r>
-        <w:rPr>
-          <w:color w:val="215E99" w:themeColor="text2" w:themeTint="BF"/>
-          <w:lang w:val="en-US"/>
-        </w:rPr>
-        <w:t>of the ranking and intended alpha spending is a good start.</w:t>
-      </w:r>
-    </w:p>
-    <w:p>
-      <w:pPr>
-        <w:rPr>
           <w:rFonts w:ascii="Times New Roman" w:eastAsiaTheme="majorEastAsia" w:hAnsi="Times New Roman" w:cs="Times New Roman"/>
           <w:color w:val="0F4761" w:themeColor="accent1" w:themeShade="BF"/>
           <w:sz w:val="40"/>
@@ -12477,6 +12451,106 @@
           <w:lang w:val="en-US"/>
         </w:rPr>
       </w:pPr>
+      <w:r>
+        <w:rPr>
+          <w:color w:val="215E99" w:themeColor="text2" w:themeTint="BF"/>
+          <w:lang w:val="en-US"/>
+        </w:rPr>
+        <w:t>Again gatekeeping can be used in conjunction with other adjustment technics, e.g., Bonferroni adjust H</w:t>
+      </w:r>
+      <w:r>
+        <w:rPr>
+          <w:color w:val="215E99" w:themeColor="text2" w:themeTint="BF"/>
+          <w:vertAlign w:val="subscript"/>
+          <w:lang w:val="en-US"/>
+        </w:rPr>
+        <w:t>2,1</w:t>
+      </w:r>
+      <w:r>
+        <w:rPr>
+          <w:color w:val="215E99" w:themeColor="text2" w:themeTint="BF"/>
+          <w:lang w:val="en-US"/>
+        </w:rPr>
+        <w:t xml:space="preserve"> and H</w:t>
+      </w:r>
+      <w:r>
+        <w:rPr>
+          <w:color w:val="215E99" w:themeColor="text2" w:themeTint="BF"/>
+          <w:vertAlign w:val="subscript"/>
+          <w:lang w:val="en-US"/>
+        </w:rPr>
+        <w:t>2,2</w:t>
+      </w:r>
+      <w:r>
+        <w:rPr>
+          <w:color w:val="215E99" w:themeColor="text2" w:themeTint="BF"/>
+          <w:lang w:val="en-US"/>
+        </w:rPr>
+        <w:t xml:space="preserve"> and if any is rejected Bonferroni adjust H</w:t>
+      </w:r>
+      <w:r>
+        <w:rPr>
+          <w:color w:val="215E99" w:themeColor="text2" w:themeTint="BF"/>
+          <w:vertAlign w:val="subscript"/>
+          <w:lang w:val="en-US"/>
+        </w:rPr>
+        <w:t>2,3</w:t>
+      </w:r>
+      <w:r>
+        <w:rPr>
+          <w:color w:val="215E99" w:themeColor="text2" w:themeTint="BF"/>
+          <w:lang w:val="en-US"/>
+        </w:rPr>
+        <w:t xml:space="preserve"> and H</w:t>
+      </w:r>
+      <w:r>
+        <w:rPr>
+          <w:color w:val="215E99" w:themeColor="text2" w:themeTint="BF"/>
+          <w:vertAlign w:val="subscript"/>
+          <w:lang w:val="en-US"/>
+        </w:rPr>
+        <w:t>2,4</w:t>
+      </w:r>
+      <w:r>
+        <w:rPr>
+          <w:color w:val="215E99" w:themeColor="text2" w:themeTint="BF"/>
+          <w:lang w:val="en-US"/>
+        </w:rPr>
+        <w:t xml:space="preserve">. This </w:t>
+      </w:r>
+      <w:r>
+        <w:rPr>
+          <w:color w:val="215E99" w:themeColor="text2" w:themeTint="BF"/>
+          <w:lang w:val="en-US"/>
+        </w:rPr>
+        <w:t xml:space="preserve">can quickly become technical so a </w:t>
+      </w:r>
+      <w:commentRangeStart w:id="25"/>
+      <w:r>
+        <w:rPr>
+          <w:color w:val="215E99" w:themeColor="text2" w:themeTint="BF"/>
+          <w:lang w:val="en-US"/>
+        </w:rPr>
+        <w:t xml:space="preserve">graphical representation </w:t>
+      </w:r>
+      <w:commentRangeEnd w:id="25"/>
+      <w:r>
+        <w:rPr>
+          <w:rStyle w:val="Kommentarhenvisning"/>
+          <w:color w:val="215E99" w:themeColor="text2" w:themeTint="BF"/>
+          <w:sz w:val="24"/>
+          <w:szCs w:val="24"/>
+          <w:lang w:val="en-US"/>
+        </w:rPr>
+        <w:commentReference w:id="25"/>
+      </w:r>
+      <w:r>
+        <w:rPr>
+          <w:color w:val="215E99" w:themeColor="text2" w:themeTint="BF"/>
+          <w:lang w:val="en-US"/>
+        </w:rPr>
+        <w:t>of the ranking and intended alpha spending is a good start.</w:t>
+      </w:r>
       <w:r>
         <w:rPr>
           <w:rFonts w:ascii="Times New Roman" w:hAnsi="Times New Roman" w:cs="Times New Roman"/>
@@ -16131,8 +16205,8 @@
       </w:pPr>
     </w:p>
     <w:sectPr>
-      <w:headerReference w:type="default" r:id="rId12"/>
-      <w:footerReference w:type="default" r:id="rId13"/>
+      <w:headerReference w:type="default" r:id="rId13"/>
+      <w:footerReference w:type="default" r:id="rId14"/>
       <w:pgSz w:w="11906" w:h="16838"/>
       <w:pgMar w:top="1440" w:right="1440" w:bottom="1440" w:left="1440" w:header="708" w:footer="708" w:gutter="0"/>
       <w:cols w:space="708"/>

</xml_diff>